<commit_message>
Fix baseUrl resolution to support all Vercel preview domains and add 2s timeout fallback for auth login
</commit_message>
<xml_diff>
--- a/Limitless_Naturals_Technical_Proposal.docx
+++ b/Limitless_Naturals_Technical_Proposal.docx
@@ -10,7 +10,7 @@
         <w:rPr>
           <w:b/>
           <w:color w:val="10B981"/>
-          <w:sz w:val="28"/>
+          <w:sz w:val="26"/>
         </w:rPr>
         <w:t>LIMITLESS NATURALS BY EVA PHARMA</w:t>
         <w:br/>
@@ -19,25 +19,25 @@
         <w:rPr>
           <w:b/>
           <w:color w:val="0F172A"/>
-          <w:sz w:val="44"/>
+          <w:sz w:val="40"/>
         </w:rPr>
-        <w:t>TECHNICAL &amp; BUSINESS PROPOSAL</w:t>
+        <w:t>COMMERCIAL &amp; TECHNICAL FINANCIAL PROPOSAL</w:t>
         <w:br/>
       </w:r>
       <w:r>
         <w:rPr>
           <w:i/>
           <w:color w:val="64748B"/>
-          <w:sz w:val="24"/>
+          <w:sz w:val="22"/>
         </w:rPr>
         <w:t>Cross-Platform Mobile Application (iOS &amp; Android) &amp; Full-Stack Web Platform</w:t>
         <w:br/>
-        <w:t>High-Availability Enterprise Solution for 2M Users &amp; 2,000 Concurrent Connections</w:t>
+        <w:t>Delivery &amp; Operational Cost Breakdowns | 2M Clients &amp; 2,000 Concurrent Sizing</w:t>
       </w:r>
     </w:p>
     <w:p>
       <w:pPr>
-        <w:spacing w:after="240"/>
+        <w:spacing w:after="200"/>
       </w:pPr>
     </w:p>
     <w:p>
@@ -48,17 +48,14 @@
         <w:rPr>
           <w:b/>
           <w:color w:val="10B981"/>
-          <w:sz w:val="32"/>
+          <w:sz w:val="30"/>
         </w:rPr>
-        <w:t>1. Executive Summary</w:t>
+        <w:t>1. Executive Summary &amp; Financial Overview</w:t>
       </w:r>
     </w:p>
     <w:p>
-      <w:pPr>
-        <w:spacing w:line="276" w:lineRule="auto"/>
-      </w:pPr>
       <w:r>
-        <w:t>This technical proposal outlines the end-to-end software architecture, infrastructure design, agile team structure, licensing breakdown, and execution roadmap for the Limitless Naturals Mobile Application (iOS &amp; Android) and Web E-Commerce Platform. Engineered specifically for Eva Pharma, the platform seamlessly integrates personalized AI health recommendation engines, chronic disease safety contraindications, a multi-channel admin notification center, real-time logistics management, and scalable cloud infrastructure capable of serving 2,000,000+ registered clients with 2,000 peak concurrent active sessions.</w:t>
+        <w:t>This proposal provides the comprehensive financial pricing model, infrastructure specifications, scrum team rate guidance, and complete business feature architecture for the Limitless Naturals Mobile Application (iOS &amp; Android) and Web E-Commerce Platform. The pricing model cleanly distinguishes between the Project Delivery Cost (turnkey software engineering spread across 6 milestones) and the Monthly Operational Infrastructure Costs (AWS hosting, SMS, Email, and Payment Gateway transactions).</w:t>
       </w:r>
     </w:p>
     <w:p>
@@ -69,14 +66,220 @@
         <w:rPr>
           <w:b/>
           <w:color w:val="10B981"/>
-          <w:sz w:val="32"/>
+          <w:sz w:val="30"/>
         </w:rPr>
-        <w:t>2. Proposed Infrastructure &amp; Scale Specifications</w:t>
+        <w:t>2. Complete Business Feature Matrix</w:t>
       </w:r>
     </w:p>
     <w:p>
       <w:r>
-        <w:t>To guarantee 99.99% availability, zero sub-second latency, and horizontal elasticity, the system is designed using Containerized Microservices architecture deployed on AWS / Google Cloud with Managed Kubernetes (EKS/GKE).</w:t>
+        <w:t>The application architecture encompasses four distinct business portals tailored for client engagement, marketing automation, and logistics:</w:t>
+      </w:r>
+    </w:p>
+    <w:p>
+      <w:pPr>
+        <w:spacing w:before="280" w:after="120"/>
+      </w:pPr>
+      <w:r>
+        <w:rPr>
+          <w:b/>
+          <w:color w:val="0F172A"/>
+          <w:sz w:val="25"/>
+        </w:rPr>
+        <w:t>A. Client Mobile App &amp; Web Storefront (iOS &amp; Android)</w:t>
+      </w:r>
+    </w:p>
+    <w:p>
+      <w:pPr>
+        <w:pStyle w:val="ListBullet"/>
+      </w:pPr>
+      <w:r>
+        <w:t>Personalized Health Profile Matrix: Chronic disease input (Hypertension, Kidney Disease, Allergies, Medication notes).</w:t>
+      </w:r>
+    </w:p>
+    <w:p>
+      <w:pPr>
+        <w:pStyle w:val="ListBullet"/>
+      </w:pPr>
+      <w:r>
+        <w:t>AI Supplement Recommendation Engine: Algorithmic matching of patient health profiles against active ingredient dosages.</w:t>
+      </w:r>
+    </w:p>
+    <w:p>
+      <w:pPr>
+        <w:pStyle w:val="ListBullet"/>
+      </w:pPr>
+      <w:r>
+        <w:t>Medical Contraindication Safety Engine: Automated safety checks flagging dangerous interactions (e.g., Ginseng in severe hypertension).</w:t>
+      </w:r>
+    </w:p>
+    <w:p>
+      <w:pPr>
+        <w:pStyle w:val="ListBullet"/>
+      </w:pPr>
+      <w:r>
+        <w:t>Hydration &amp; Electrolyte Need Calculator: Dynamic daily water/electrolyte calculation based on body weight and activity level.</w:t>
+      </w:r>
+    </w:p>
+    <w:p>
+      <w:pPr>
+        <w:pStyle w:val="ListBullet"/>
+      </w:pPr>
+      <w:r>
+        <w:t>Limitless Product Catalog: Multi-category browsing (Daily Wellness, Immune Defense, Hydration) with full ingredient breakdowns.</w:t>
+      </w:r>
+    </w:p>
+    <w:p>
+      <w:pPr>
+        <w:pStyle w:val="ListBullet"/>
+      </w:pPr>
+      <w:r>
+        <w:t>E-Commerce Cart &amp; Checkout: Promo code validation, address management, Credit Card / Cash-on-Delivery (COD).</w:t>
+      </w:r>
+    </w:p>
+    <w:p>
+      <w:pPr>
+        <w:pStyle w:val="ListBullet"/>
+      </w:pPr>
+      <w:r>
+        <w:t>Live Order Status Stepper: 4-stage delivery tracking (Placed -&gt; Processing -&gt; Out for Delivery -&gt; Delivered).</w:t>
+      </w:r>
+    </w:p>
+    <w:p>
+      <w:pPr>
+        <w:spacing w:before="280" w:after="120"/>
+      </w:pPr>
+      <w:r>
+        <w:rPr>
+          <w:b/>
+          <w:color w:val="0F172A"/>
+          <w:sz w:val="25"/>
+        </w:rPr>
+        <w:t>B. Admin Portal &amp; Multi-Channel Notification Center</w:t>
+      </w:r>
+    </w:p>
+    <w:p>
+      <w:pPr>
+        <w:pStyle w:val="ListBullet"/>
+      </w:pPr>
+      <w:r>
+        <w:t>Multi-Channel Broadcast Engine: Send campaigns via Android Push, iOS Push, Transactional Email, and SMS.</w:t>
+      </w:r>
+    </w:p>
+    <w:p>
+      <w:pPr>
+        <w:pStyle w:val="ListBullet"/>
+      </w:pPr>
+      <w:r>
+        <w:t>Target Audience Segmentation: Filter recipients by chronic conditions, order history, or abandoned cart status.</w:t>
+      </w:r>
+    </w:p>
+    <w:p>
+      <w:pPr>
+        <w:pStyle w:val="ListBullet"/>
+      </w:pPr>
+      <w:r>
+        <w:t>Automated AI Triggers &amp; Discounts: Rule engine for automated AI health recommendations and low-stock promo broadcasts.</w:t>
+      </w:r>
+    </w:p>
+    <w:p>
+      <w:pPr>
+        <w:pStyle w:val="ListBullet"/>
+      </w:pPr>
+      <w:r>
+        <w:t>Product Catalog Management: Full CRUD capability to modify SKUs, prices, stock levels, contraindications, and imagery.</w:t>
+      </w:r>
+    </w:p>
+    <w:p>
+      <w:pPr>
+        <w:pStyle w:val="ListBullet"/>
+      </w:pPr>
+      <w:r>
+        <w:t>Order Management &amp; Payment Toggling: Real-time order fulfillment control and payment status toggle ('Paid' vs 'Pending').</w:t>
+      </w:r>
+    </w:p>
+    <w:p>
+      <w:pPr>
+        <w:pStyle w:val="ListBullet"/>
+      </w:pPr>
+      <w:r>
+        <w:t>Executive Sales &amp; Financial Dashboard: Revenue analytics, top-performing SKUs, conversion funnel, and distributor metrics.</w:t>
+      </w:r>
+    </w:p>
+    <w:p>
+      <w:pPr>
+        <w:spacing w:before="280" w:after="120"/>
+      </w:pPr>
+      <w:r>
+        <w:rPr>
+          <w:b/>
+          <w:color w:val="0F172A"/>
+          <w:sz w:val="25"/>
+        </w:rPr>
+        <w:t>C. Distributor Logistics &amp; Warehouse Portal</w:t>
+      </w:r>
+    </w:p>
+    <w:p>
+      <w:pPr>
+        <w:pStyle w:val="ListBullet"/>
+      </w:pPr>
+      <w:r>
+        <w:t>Driver Delivery Queue: Dedicated dispatch view for assigned couriers with express routing details.</w:t>
+      </w:r>
+    </w:p>
+    <w:p>
+      <w:pPr>
+        <w:pStyle w:val="ListBullet"/>
+      </w:pPr>
+      <w:r>
+        <w:t>Order Logistics Progression: Stepper updating order state from Pending -&gt; Picked Up -&gt; Out for Delivery -&gt; Delivered.</w:t>
+      </w:r>
+    </w:p>
+    <w:p>
+      <w:pPr>
+        <w:pStyle w:val="ListBullet"/>
+      </w:pPr>
+      <w:r>
+        <w:t>Warehouse Capacity Gauges: Live storage utilization tracking with automated low-stock reorder warnings.</w:t>
+      </w:r>
+    </w:p>
+    <w:p>
+      <w:pPr>
+        <w:spacing w:before="280" w:after="120"/>
+      </w:pPr>
+      <w:r>
+        <w:rPr>
+          <w:b/>
+          <w:color w:val="0F172A"/>
+          <w:sz w:val="25"/>
+        </w:rPr>
+        <w:t>D. Visitor / Public Storefront</w:t>
+      </w:r>
+    </w:p>
+    <w:p>
+      <w:pPr>
+        <w:pStyle w:val="ListBullet"/>
+      </w:pPr>
+      <w:r>
+        <w:t>Full access to official Limitless catalog, health tag filters, ingredient disclosures, and quick demo registration prompts.</w:t>
+      </w:r>
+    </w:p>
+    <w:p>
+      <w:pPr>
+        <w:spacing w:before="280" w:after="120"/>
+      </w:pPr>
+      <w:r>
+        <w:rPr>
+          <w:b/>
+          <w:color w:val="10B981"/>
+          <w:sz w:val="30"/>
+        </w:rPr>
+        <w:t>3. Agile Scrum Team Resource Pricing Guidance</w:t>
+      </w:r>
+    </w:p>
+    <w:p>
+      <w:r>
+        <w:t>The project is powered by an 11-member dedicated Scrum team operating across an 8-month development cycle. Below is the monthly rate card guidance per role:</w:t>
       </w:r>
     </w:p>
     <w:tbl>
@@ -103,7 +306,7 @@
                 <w:b/>
                 <w:color w:val="FFFFFF"/>
               </w:rPr>
-              <w:t>Metric / Layer</w:t>
+              <w:t>Scrum Role</w:t>
             </w:r>
           </w:p>
         </w:tc>
@@ -118,7 +321,7 @@
                 <w:b/>
                 <w:color w:val="FFFFFF"/>
               </w:rPr>
-              <w:t>Proposed Infrastructure Spec</w:t>
+              <w:t>Headcount</w:t>
             </w:r>
           </w:p>
         </w:tc>
@@ -133,7 +336,7 @@
                 <w:b/>
                 <w:color w:val="FFFFFF"/>
               </w:rPr>
-              <w:t>Scaling Policy</w:t>
+              <w:t>Monthly Rate per Specialist (EGP)</w:t>
             </w:r>
           </w:p>
         </w:tc>
@@ -148,7 +351,7 @@
                 <w:b/>
                 <w:color w:val="FFFFFF"/>
               </w:rPr>
-              <w:t>Purpose / Rationale</w:t>
+              <w:t>Total Monthly Role Cost (EGP)</w:t>
             </w:r>
           </w:p>
         </w:tc>
@@ -161,7 +364,7 @@
           </w:tcPr>
           <w:p>
             <w:r>
-              <w:t>Target Load</w:t>
+              <w:t>Product Owner (PO)</w:t>
             </w:r>
           </w:p>
         </w:tc>
@@ -172,7 +375,7 @@
           </w:tcPr>
           <w:p>
             <w:r>
-              <w:t>2,000,000 Registered Clients | 2,000 Concurrent Users</w:t>
+              <w:t>1x</w:t>
             </w:r>
           </w:p>
         </w:tc>
@@ -183,7 +386,7 @@
           </w:tcPr>
           <w:p>
             <w:r>
-              <w:t>N/A</w:t>
+              <w:t>80,000 EGP</w:t>
             </w:r>
           </w:p>
         </w:tc>
@@ -194,7 +397,7 @@
           </w:tcPr>
           <w:p>
             <w:r>
-              <w:t>Design benchmark for 150 requests/sec throughput</w:t>
+              <w:t>80,000 EGP</w:t>
             </w:r>
           </w:p>
         </w:tc>
@@ -207,7 +410,7 @@
           </w:tcPr>
           <w:p>
             <w:r>
-              <w:t>DNS &amp; CDN Layer</w:t>
+              <w:t>Scrum Master (SM)</w:t>
             </w:r>
           </w:p>
         </w:tc>
@@ -218,7 +421,7 @@
           </w:tcPr>
           <w:p>
             <w:r>
-              <w:t>Cloudflare Enterprise / AWS CloudFront + Route53</w:t>
+              <w:t>1x</w:t>
             </w:r>
           </w:p>
         </w:tc>
@@ -229,7 +432,7 @@
           </w:tcPr>
           <w:p>
             <w:r>
-              <w:t>Edge Caching &amp; DDoS Mitigation</w:t>
+              <w:t>60,000 EGP</w:t>
             </w:r>
           </w:p>
         </w:tc>
@@ -240,7 +443,7 @@
           </w:tcPr>
           <w:p>
             <w:r>
-              <w:t>Static asset acceleration, Web Application Firewall (WAF), SSL</w:t>
+              <w:t>60,000 EGP</w:t>
             </w:r>
           </w:p>
         </w:tc>
@@ -253,7 +456,7 @@
           </w:tcPr>
           <w:p>
             <w:r>
-              <w:t>Load Balancer</w:t>
+              <w:t>UI/UX Designer</w:t>
             </w:r>
           </w:p>
         </w:tc>
@@ -264,7 +467,7 @@
           </w:tcPr>
           <w:p>
             <w:r>
-              <w:t>AWS Application Load Balancer (ALB) Multi-AZ</w:t>
+              <w:t>1x</w:t>
             </w:r>
           </w:p>
         </w:tc>
@@ -275,7 +478,7 @@
           </w:tcPr>
           <w:p>
             <w:r>
-              <w:t>Auto-SSL &amp; Health Checks</w:t>
+              <w:t>40,000 EGP</w:t>
             </w:r>
           </w:p>
         </w:tc>
@@ -286,7 +489,7 @@
           </w:tcPr>
           <w:p>
             <w:r>
-              <w:t>Distributes API traffic across healthy node instances</w:t>
+              <w:t>40,000 EGP</w:t>
             </w:r>
           </w:p>
         </w:tc>
@@ -299,7 +502,7 @@
           </w:tcPr>
           <w:p>
             <w:r>
-              <w:t>App Server Cluster</w:t>
+              <w:t>Mobile Developers (Flutter iOS/Android)</w:t>
             </w:r>
           </w:p>
         </w:tc>
@@ -310,7 +513,7 @@
           </w:tcPr>
           <w:p>
             <w:r>
-              <w:t>AWS EKS (Kubernetes) - 3x c6g.xlarge (4 vCPU, 8GB RAM)</w:t>
+              <w:t>2x</w:t>
             </w:r>
           </w:p>
         </w:tc>
@@ -321,7 +524,7 @@
           </w:tcPr>
           <w:p>
             <w:r>
-              <w:t>HPA: Auto-scales to 10 nodes at 70% CPU</w:t>
+              <w:t>50,000 EGP</w:t>
             </w:r>
           </w:p>
         </w:tc>
@@ -332,7 +535,7 @@
           </w:tcPr>
           <w:p>
             <w:r>
-              <w:t>Runs Node.js API instances &amp; Flutter Web static assets</w:t>
+              <w:t>100,000 EGP</w:t>
             </w:r>
           </w:p>
         </w:tc>
@@ -345,7 +548,7 @@
           </w:tcPr>
           <w:p>
             <w:r>
-              <w:t>Cache &amp; Session</w:t>
+              <w:t>Backend Developers (Node.js/Postgres)</w:t>
             </w:r>
           </w:p>
         </w:tc>
@@ -356,7 +559,7 @@
           </w:tcPr>
           <w:p>
             <w:r>
-              <w:t>Redis Cluster (AWS ElastiCache, 2x cache.m6g.large)</w:t>
+              <w:t>3x</w:t>
             </w:r>
           </w:p>
         </w:tc>
@@ -367,7 +570,7 @@
           </w:tcPr>
           <w:p>
             <w:r>
-              <w:t>Multi-AZ Failover + In-Memory Replication</w:t>
+              <w:t>50,000 EGP</w:t>
             </w:r>
           </w:p>
         </w:tc>
@@ -378,7 +581,7 @@
           </w:tcPr>
           <w:p>
             <w:r>
-              <w:t>Sub-5ms session storage, shopping carts, rate-limiting</w:t>
+              <w:t>150,000 EGP</w:t>
             </w:r>
           </w:p>
         </w:tc>
@@ -391,7 +594,7 @@
           </w:tcPr>
           <w:p>
             <w:r>
-              <w:t>Primary Database</w:t>
+              <w:t>DevOps Engineer</w:t>
             </w:r>
           </w:p>
         </w:tc>
@@ -402,7 +605,7 @@
           </w:tcPr>
           <w:p>
             <w:r>
-              <w:t>AWS Aurora PostgreSQL Multi-AZ (Primary 4 vCPU, 32GB RAM)</w:t>
+              <w:t>1x</w:t>
             </w:r>
           </w:p>
         </w:tc>
@@ -413,7 +616,7 @@
           </w:tcPr>
           <w:p>
             <w:r>
-              <w:t>1 Read Replica for Reports &amp; Analytics</w:t>
+              <w:t>50,000 EGP</w:t>
             </w:r>
           </w:p>
         </w:tc>
@@ -424,7 +627,7 @@
           </w:tcPr>
           <w:p>
             <w:r>
-              <w:t>ACID-compliant relational store for orders, users, catalog</w:t>
+              <w:t>50,000 EGP</w:t>
             </w:r>
           </w:p>
         </w:tc>
@@ -437,7 +640,7 @@
           </w:tcPr>
           <w:p>
             <w:r>
-              <w:t>Object Storage</w:t>
+              <w:t>QC / QA Engineers</w:t>
             </w:r>
           </w:p>
         </w:tc>
@@ -448,7 +651,7 @@
           </w:tcPr>
           <w:p>
             <w:r>
-              <w:t>AWS S3 Bucket with CDN distribution</w:t>
+              <w:t>2x</w:t>
             </w:r>
           </w:p>
         </w:tc>
@@ -459,7 +662,7 @@
           </w:tcPr>
           <w:p>
             <w:r>
-              <w:t>Lifecycle Archival to Glacier</w:t>
+              <w:t>50,000 EGP</w:t>
             </w:r>
           </w:p>
         </w:tc>
@@ -470,7 +673,610 @@
           </w:tcPr>
           <w:p>
             <w:r>
-              <w:t>Product images, user health profile documents, avatars</w:t>
+              <w:t>100,000 EGP</w:t>
+            </w:r>
+          </w:p>
+        </w:tc>
+      </w:tr>
+      <w:tr>
+        <w:tc>
+          <w:tcPr>
+            <w:tcW w:type="dxa" w:w="2484"/>
+            <w:shd w:fill="10B981"/>
+          </w:tcPr>
+          <w:p>
+            <w:r>
+              <w:rPr>
+                <w:b/>
+                <w:color w:val="FFFFFF"/>
+              </w:rPr>
+              <w:t>TOTAL MONTHLY SCRUM TEAM COST</w:t>
+            </w:r>
+          </w:p>
+        </w:tc>
+        <w:tc>
+          <w:tcPr>
+            <w:tcW w:type="dxa" w:w="2484"/>
+            <w:shd w:fill="10B981"/>
+          </w:tcPr>
+          <w:p>
+            <w:r>
+              <w:rPr>
+                <w:b/>
+                <w:color w:val="FFFFFF"/>
+              </w:rPr>
+              <w:t>11 Members</w:t>
+            </w:r>
+          </w:p>
+        </w:tc>
+        <w:tc>
+          <w:tcPr>
+            <w:tcW w:type="dxa" w:w="2484"/>
+            <w:shd w:fill="10B981"/>
+          </w:tcPr>
+          <w:p>
+            <w:r>
+              <w:rPr>
+                <w:b/>
+                <w:color w:val="FFFFFF"/>
+              </w:rPr>
+              <w:t>---</w:t>
+            </w:r>
+          </w:p>
+        </w:tc>
+        <w:tc>
+          <w:tcPr>
+            <w:tcW w:type="dxa" w:w="2484"/>
+            <w:shd w:fill="10B981"/>
+          </w:tcPr>
+          <w:p>
+            <w:r>
+              <w:rPr>
+                <w:b/>
+                <w:color w:val="FFFFFF"/>
+              </w:rPr>
+              <w:t>580,000 EGP / month</w:t>
+            </w:r>
+          </w:p>
+        </w:tc>
+      </w:tr>
+    </w:tbl>
+    <w:p>
+      <w:pPr>
+        <w:spacing w:before="160"/>
+      </w:pPr>
+      <w:r>
+        <w:rPr>
+          <w:b/>
+          <w:color w:val="10B981"/>
+          <w:sz w:val="23"/>
+        </w:rPr>
+        <w:t>Total 8-Month Project Delivery Budget = 580,000 EGP/month x 8 Months = 4,640,000 EGP Total</w:t>
+      </w:r>
+    </w:p>
+    <w:p>
+      <w:pPr>
+        <w:spacing w:before="280" w:after="120"/>
+      </w:pPr>
+      <w:r>
+        <w:rPr>
+          <w:b/>
+          <w:color w:val="10B981"/>
+          <w:sz w:val="30"/>
+        </w:rPr>
+        <w:t>4. Delivery Cost Milestone Breakdown (Project Budget: 4,640,000 EGP)</w:t>
+      </w:r>
+    </w:p>
+    <w:p>
+      <w:r>
+        <w:t>Project delivery pricing (4,640,000 EGP total) is structured into 6 milestone payments tied directly to deliverable verification:</w:t>
+      </w:r>
+    </w:p>
+    <w:tbl>
+      <w:tblPr>
+        <w:tblW w:type="auto" w:w="0"/>
+        <w:jc w:val="center"/>
+        <w:tblLook w:firstColumn="1" w:firstRow="1" w:lastColumn="0" w:lastRow="0" w:noHBand="0" w:noVBand="1" w:val="04A0"/>
+      </w:tblPr>
+      <w:tblGrid>
+        <w:gridCol w:w="1987"/>
+        <w:gridCol w:w="1987"/>
+        <w:gridCol w:w="1987"/>
+        <w:gridCol w:w="1987"/>
+        <w:gridCol w:w="1987"/>
+      </w:tblGrid>
+      <w:tr>
+        <w:tc>
+          <w:tcPr>
+            <w:tcW w:type="dxa" w:w="1987"/>
+            <w:shd w:fill="0F172A"/>
+          </w:tcPr>
+          <w:p>
+            <w:r>
+              <w:rPr>
+                <w:b/>
+                <w:color w:val="FFFFFF"/>
+              </w:rPr>
+              <w:t>Milestone Phase</w:t>
+            </w:r>
+          </w:p>
+        </w:tc>
+        <w:tc>
+          <w:tcPr>
+            <w:tcW w:type="dxa" w:w="1987"/>
+            <w:shd w:fill="0F172A"/>
+          </w:tcPr>
+          <w:p>
+            <w:r>
+              <w:rPr>
+                <w:b/>
+                <w:color w:val="FFFFFF"/>
+              </w:rPr>
+              <w:t>Timeline</w:t>
+            </w:r>
+          </w:p>
+        </w:tc>
+        <w:tc>
+          <w:tcPr>
+            <w:tcW w:type="dxa" w:w="1987"/>
+            <w:shd w:fill="0F172A"/>
+          </w:tcPr>
+          <w:p>
+            <w:r>
+              <w:rPr>
+                <w:b/>
+                <w:color w:val="FFFFFF"/>
+              </w:rPr>
+              <w:t>Payment %</w:t>
+            </w:r>
+          </w:p>
+        </w:tc>
+        <w:tc>
+          <w:tcPr>
+            <w:tcW w:type="dxa" w:w="1987"/>
+            <w:shd w:fill="0F172A"/>
+          </w:tcPr>
+          <w:p>
+            <w:r>
+              <w:rPr>
+                <w:b/>
+                <w:color w:val="FFFFFF"/>
+              </w:rPr>
+              <w:t>Milestone Amount (EGP)</w:t>
+            </w:r>
+          </w:p>
+        </w:tc>
+        <w:tc>
+          <w:tcPr>
+            <w:tcW w:type="dxa" w:w="1987"/>
+            <w:shd w:fill="0F172A"/>
+          </w:tcPr>
+          <w:p>
+            <w:r>
+              <w:rPr>
+                <w:b/>
+                <w:color w:val="FFFFFF"/>
+              </w:rPr>
+              <w:t>Trigger Deliverable Condition</w:t>
+            </w:r>
+          </w:p>
+        </w:tc>
+      </w:tr>
+      <w:tr>
+        <w:tc>
+          <w:tcPr>
+            <w:tcW w:type="dxa" w:w="1987"/>
+            <w:shd w:fill="F8FAFC"/>
+          </w:tcPr>
+          <w:p>
+            <w:r>
+              <w:t>Milestone 1: Kickoff &amp; SRS</w:t>
+            </w:r>
+          </w:p>
+        </w:tc>
+        <w:tc>
+          <w:tcPr>
+            <w:tcW w:type="dxa" w:w="1987"/>
+            <w:shd w:fill="FFFFFF"/>
+          </w:tcPr>
+          <w:p>
+            <w:r>
+              <w:t>Month 1</w:t>
+            </w:r>
+          </w:p>
+        </w:tc>
+        <w:tc>
+          <w:tcPr>
+            <w:tcW w:type="dxa" w:w="1987"/>
+            <w:shd w:fill="F8FAFC"/>
+          </w:tcPr>
+          <w:p>
+            <w:r>
+              <w:t>15%</w:t>
+            </w:r>
+          </w:p>
+        </w:tc>
+        <w:tc>
+          <w:tcPr>
+            <w:tcW w:type="dxa" w:w="1987"/>
+            <w:shd w:fill="FFFFFF"/>
+          </w:tcPr>
+          <w:p>
+            <w:r>
+              <w:t>696,000 EGP</w:t>
+            </w:r>
+          </w:p>
+        </w:tc>
+        <w:tc>
+          <w:tcPr>
+            <w:tcW w:type="dxa" w:w="1987"/>
+            <w:shd w:fill="F8FAFC"/>
+          </w:tcPr>
+          <w:p>
+            <w:r>
+              <w:t>SRS document, Figma UI/UX designs, and cloud staging setup</w:t>
+            </w:r>
+          </w:p>
+        </w:tc>
+      </w:tr>
+      <w:tr>
+        <w:tc>
+          <w:tcPr>
+            <w:tcW w:type="dxa" w:w="1987"/>
+            <w:shd w:fill="F8FAFC"/>
+          </w:tcPr>
+          <w:p>
+            <w:r>
+              <w:t>Milestone 2: Core Dev Phase A</w:t>
+            </w:r>
+          </w:p>
+        </w:tc>
+        <w:tc>
+          <w:tcPr>
+            <w:tcW w:type="dxa" w:w="1987"/>
+            <w:shd w:fill="FFFFFF"/>
+          </w:tcPr>
+          <w:p>
+            <w:r>
+              <w:t>Months 2–3</w:t>
+            </w:r>
+          </w:p>
+        </w:tc>
+        <w:tc>
+          <w:tcPr>
+            <w:tcW w:type="dxa" w:w="1987"/>
+            <w:shd w:fill="F8FAFC"/>
+          </w:tcPr>
+          <w:p>
+            <w:r>
+              <w:t>25%</w:t>
+            </w:r>
+          </w:p>
+        </w:tc>
+        <w:tc>
+          <w:tcPr>
+            <w:tcW w:type="dxa" w:w="1987"/>
+            <w:shd w:fill="FFFFFF"/>
+          </w:tcPr>
+          <w:p>
+            <w:r>
+              <w:t>1,160,000 EGP</w:t>
+            </w:r>
+          </w:p>
+        </w:tc>
+        <w:tc>
+          <w:tcPr>
+            <w:tcW w:type="dxa" w:w="1987"/>
+            <w:shd w:fill="F8FAFC"/>
+          </w:tcPr>
+          <w:p>
+            <w:r>
+              <w:t>Sprints 1–3: Mobile Client App, Auth, AI Engine &amp; Catalog</w:t>
+            </w:r>
+          </w:p>
+        </w:tc>
+      </w:tr>
+      <w:tr>
+        <w:tc>
+          <w:tcPr>
+            <w:tcW w:type="dxa" w:w="1987"/>
+            <w:shd w:fill="F8FAFC"/>
+          </w:tcPr>
+          <w:p>
+            <w:r>
+              <w:t>Milestone 3: Core Dev Phase B</w:t>
+            </w:r>
+          </w:p>
+        </w:tc>
+        <w:tc>
+          <w:tcPr>
+            <w:tcW w:type="dxa" w:w="1987"/>
+            <w:shd w:fill="FFFFFF"/>
+          </w:tcPr>
+          <w:p>
+            <w:r>
+              <w:t>Month 4</w:t>
+            </w:r>
+          </w:p>
+        </w:tc>
+        <w:tc>
+          <w:tcPr>
+            <w:tcW w:type="dxa" w:w="1987"/>
+            <w:shd w:fill="F8FAFC"/>
+          </w:tcPr>
+          <w:p>
+            <w:r>
+              <w:t>25%</w:t>
+            </w:r>
+          </w:p>
+        </w:tc>
+        <w:tc>
+          <w:tcPr>
+            <w:tcW w:type="dxa" w:w="1987"/>
+            <w:shd w:fill="FFFFFF"/>
+          </w:tcPr>
+          <w:p>
+            <w:r>
+              <w:t>1,160,000 EGP</w:t>
+            </w:r>
+          </w:p>
+        </w:tc>
+        <w:tc>
+          <w:tcPr>
+            <w:tcW w:type="dxa" w:w="1987"/>
+            <w:shd w:fill="F8FAFC"/>
+          </w:tcPr>
+          <w:p>
+            <w:r>
+              <w:t>Sprints 4–6: Admin Notification Center, Checkout &amp; Distributor App</w:t>
+            </w:r>
+          </w:p>
+        </w:tc>
+      </w:tr>
+      <w:tr>
+        <w:tc>
+          <w:tcPr>
+            <w:tcW w:type="dxa" w:w="1987"/>
+            <w:shd w:fill="F8FAFC"/>
+          </w:tcPr>
+          <w:p>
+            <w:r>
+              <w:t>Milestone 4: SIT Testing</w:t>
+            </w:r>
+          </w:p>
+        </w:tc>
+        <w:tc>
+          <w:tcPr>
+            <w:tcW w:type="dxa" w:w="1987"/>
+            <w:shd w:fill="FFFFFF"/>
+          </w:tcPr>
+          <w:p>
+            <w:r>
+              <w:t>Month 5</w:t>
+            </w:r>
+          </w:p>
+        </w:tc>
+        <w:tc>
+          <w:tcPr>
+            <w:tcW w:type="dxa" w:w="1987"/>
+            <w:shd w:fill="F8FAFC"/>
+          </w:tcPr>
+          <w:p>
+            <w:r>
+              <w:t>15%</w:t>
+            </w:r>
+          </w:p>
+        </w:tc>
+        <w:tc>
+          <w:tcPr>
+            <w:tcW w:type="dxa" w:w="1987"/>
+            <w:shd w:fill="FFFFFF"/>
+          </w:tcPr>
+          <w:p>
+            <w:r>
+              <w:t>696,000 EGP</w:t>
+            </w:r>
+          </w:p>
+        </w:tc>
+        <w:tc>
+          <w:tcPr>
+            <w:tcW w:type="dxa" w:w="1987"/>
+            <w:shd w:fill="F8FAFC"/>
+          </w:tcPr>
+          <w:p>
+            <w:r>
+              <w:t>SIT testing, security audit, and 2,000 concurrent load stress test</w:t>
+            </w:r>
+          </w:p>
+        </w:tc>
+      </w:tr>
+      <w:tr>
+        <w:tc>
+          <w:tcPr>
+            <w:tcW w:type="dxa" w:w="1987"/>
+            <w:shd w:fill="F8FAFC"/>
+          </w:tcPr>
+          <w:p>
+            <w:r>
+              <w:t>Milestone 5: UAT Testing</w:t>
+            </w:r>
+          </w:p>
+        </w:tc>
+        <w:tc>
+          <w:tcPr>
+            <w:tcW w:type="dxa" w:w="1987"/>
+            <w:shd w:fill="FFFFFF"/>
+          </w:tcPr>
+          <w:p>
+            <w:r>
+              <w:t>Months 6–7</w:t>
+            </w:r>
+          </w:p>
+        </w:tc>
+        <w:tc>
+          <w:tcPr>
+            <w:tcW w:type="dxa" w:w="1987"/>
+            <w:shd w:fill="F8FAFC"/>
+          </w:tcPr>
+          <w:p>
+            <w:r>
+              <w:t>10%</w:t>
+            </w:r>
+          </w:p>
+        </w:tc>
+        <w:tc>
+          <w:tcPr>
+            <w:tcW w:type="dxa" w:w="1987"/>
+            <w:shd w:fill="FFFFFF"/>
+          </w:tcPr>
+          <w:p>
+            <w:r>
+              <w:t>464,000 EGP</w:t>
+            </w:r>
+          </w:p>
+        </w:tc>
+        <w:tc>
+          <w:tcPr>
+            <w:tcW w:type="dxa" w:w="1987"/>
+            <w:shd w:fill="F8FAFC"/>
+          </w:tcPr>
+          <w:p>
+            <w:r>
+              <w:t>Client UAT sign-off and completion of user feedback punch list</w:t>
+            </w:r>
+          </w:p>
+        </w:tc>
+      </w:tr>
+      <w:tr>
+        <w:tc>
+          <w:tcPr>
+            <w:tcW w:type="dxa" w:w="1987"/>
+            <w:shd w:fill="F8FAFC"/>
+          </w:tcPr>
+          <w:p>
+            <w:r>
+              <w:t>Milestone 6: Go-Live &amp; Handover</w:t>
+            </w:r>
+          </w:p>
+        </w:tc>
+        <w:tc>
+          <w:tcPr>
+            <w:tcW w:type="dxa" w:w="1987"/>
+            <w:shd w:fill="FFFFFF"/>
+          </w:tcPr>
+          <w:p>
+            <w:r>
+              <w:t>Month 8</w:t>
+            </w:r>
+          </w:p>
+        </w:tc>
+        <w:tc>
+          <w:tcPr>
+            <w:tcW w:type="dxa" w:w="1987"/>
+            <w:shd w:fill="F8FAFC"/>
+          </w:tcPr>
+          <w:p>
+            <w:r>
+              <w:t>10%</w:t>
+            </w:r>
+          </w:p>
+        </w:tc>
+        <w:tc>
+          <w:tcPr>
+            <w:tcW w:type="dxa" w:w="1987"/>
+            <w:shd w:fill="FFFFFF"/>
+          </w:tcPr>
+          <w:p>
+            <w:r>
+              <w:t>464,000 EGP</w:t>
+            </w:r>
+          </w:p>
+        </w:tc>
+        <w:tc>
+          <w:tcPr>
+            <w:tcW w:type="dxa" w:w="1987"/>
+            <w:shd w:fill="F8FAFC"/>
+          </w:tcPr>
+          <w:p>
+            <w:r>
+              <w:t>App Store &amp; Google Play deployment, production cutover &amp; hypercare</w:t>
+            </w:r>
+          </w:p>
+        </w:tc>
+      </w:tr>
+      <w:tr>
+        <w:tc>
+          <w:tcPr>
+            <w:tcW w:type="dxa" w:w="1987"/>
+            <w:shd w:fill="10B981"/>
+          </w:tcPr>
+          <w:p>
+            <w:r>
+              <w:rPr>
+                <w:b/>
+                <w:color w:val="FFFFFF"/>
+              </w:rPr>
+              <w:t>TOTAL DELIVERY COST</w:t>
+            </w:r>
+          </w:p>
+        </w:tc>
+        <w:tc>
+          <w:tcPr>
+            <w:tcW w:type="dxa" w:w="1987"/>
+            <w:shd w:fill="10B981"/>
+          </w:tcPr>
+          <w:p>
+            <w:r>
+              <w:rPr>
+                <w:b/>
+                <w:color w:val="FFFFFF"/>
+              </w:rPr>
+              <w:t>8 Months</w:t>
+            </w:r>
+          </w:p>
+        </w:tc>
+        <w:tc>
+          <w:tcPr>
+            <w:tcW w:type="dxa" w:w="1987"/>
+            <w:shd w:fill="10B981"/>
+          </w:tcPr>
+          <w:p>
+            <w:r>
+              <w:rPr>
+                <w:b/>
+                <w:color w:val="FFFFFF"/>
+              </w:rPr>
+              <w:t>100%</w:t>
+            </w:r>
+          </w:p>
+        </w:tc>
+        <w:tc>
+          <w:tcPr>
+            <w:tcW w:type="dxa" w:w="1987"/>
+            <w:shd w:fill="10B981"/>
+          </w:tcPr>
+          <w:p>
+            <w:r>
+              <w:rPr>
+                <w:b/>
+                <w:color w:val="FFFFFF"/>
+              </w:rPr>
+              <w:t>4,640,000 EGP</w:t>
+            </w:r>
+          </w:p>
+        </w:tc>
+        <w:tc>
+          <w:tcPr>
+            <w:tcW w:type="dxa" w:w="1987"/>
+            <w:shd w:fill="10B981"/>
+          </w:tcPr>
+          <w:p>
+            <w:r>
+              <w:rPr>
+                <w:b/>
+                <w:color w:val="FFFFFF"/>
+              </w:rPr>
+              <w:t>Complete Turnkey System Handover</w:t>
             </w:r>
           </w:p>
         </w:tc>
@@ -484,130 +1290,14 @@
         <w:rPr>
           <w:b/>
           <w:color w:val="10B981"/>
-          <w:sz w:val="32"/>
+          <w:sz w:val="30"/>
         </w:rPr>
-        <w:t>3. Agile Scrum Team Structure &amp; Methodology</w:t>
+        <w:t>5. Monthly Infrastructure Operational Costs (2M Clients / 2K Concurrent)</w:t>
       </w:r>
     </w:p>
     <w:p>
       <w:r>
-        <w:t>The project will be executed using the Scrum Agile Framework operating in 2-week Sprint cycles. The dedicated team consists of 11 seasoned engineering specialists:</w:t>
-      </w:r>
-    </w:p>
-    <w:p>
-      <w:pPr>
-        <w:pStyle w:val="ListBullet"/>
-      </w:pPr>
-      <w:r>
-        <w:rPr>
-          <w:b/>
-        </w:rPr>
-        <w:t xml:space="preserve">1x Product Owner (PO): </w:t>
-      </w:r>
-      <w:r>
-        <w:t>Defines business backlog, accepts user stories, aligns feature prioritization with Eva Pharma stakeholders.</w:t>
-      </w:r>
-    </w:p>
-    <w:p>
-      <w:pPr>
-        <w:pStyle w:val="ListBullet"/>
-      </w:pPr>
-      <w:r>
-        <w:rPr>
-          <w:b/>
-        </w:rPr>
-        <w:t xml:space="preserve">1x Scrum Master (SM): </w:t>
-      </w:r>
-      <w:r>
-        <w:t>Facilitates daily standups, sprint planning, backlog grooming, retrospectives, and removes blockers.</w:t>
-      </w:r>
-    </w:p>
-    <w:p>
-      <w:pPr>
-        <w:pStyle w:val="ListBullet"/>
-      </w:pPr>
-      <w:r>
-        <w:rPr>
-          <w:b/>
-        </w:rPr>
-        <w:t xml:space="preserve">1x UI/UX Designer: </w:t>
-      </w:r>
-      <w:r>
-        <w:t>Crafts Figma design system, pixel-perfect iOS/Android interfaces, web design, and interactive prototypes.</w:t>
-      </w:r>
-    </w:p>
-    <w:p>
-      <w:pPr>
-        <w:pStyle w:val="ListBullet"/>
-      </w:pPr>
-      <w:r>
-        <w:rPr>
-          <w:b/>
-        </w:rPr>
-        <w:t xml:space="preserve">2x Mobile Developers: </w:t>
-      </w:r>
-      <w:r>
-        <w:t>Builds cross-platform native iOS &amp; Android apps using Flutter, managing state, push notifications, and local offline cache.</w:t>
-      </w:r>
-    </w:p>
-    <w:p>
-      <w:pPr>
-        <w:pStyle w:val="ListBullet"/>
-      </w:pPr>
-      <w:r>
-        <w:rPr>
-          <w:b/>
-        </w:rPr>
-        <w:t xml:space="preserve">3x Backend Developers: </w:t>
-      </w:r>
-      <w:r>
-        <w:t>Develops Node.js RESTful APIs, AI recommendation engine logic, payment gateways, notifications, and DB schemas.</w:t>
-      </w:r>
-    </w:p>
-    <w:p>
-      <w:pPr>
-        <w:pStyle w:val="ListBullet"/>
-      </w:pPr>
-      <w:r>
-        <w:rPr>
-          <w:b/>
-        </w:rPr>
-        <w:t xml:space="preserve">1x DevOps Engineer: </w:t>
-      </w:r>
-      <w:r>
-        <w:t>Configures CI/CD pipelines (GitHub Actions), Infrastructure-as-Code (Terraform), Kubernetes, and Grafana monitoring.</w:t>
-      </w:r>
-    </w:p>
-    <w:p>
-      <w:pPr>
-        <w:pStyle w:val="ListBullet"/>
-      </w:pPr>
-      <w:r>
-        <w:rPr>
-          <w:b/>
-        </w:rPr>
-        <w:t xml:space="preserve">2x QC / QA Engineers: </w:t>
-      </w:r>
-      <w:r>
-        <w:t>Executes manual functional tests, automated API testing (Postman/Jest), security scanning, and device matrices.</w:t>
-      </w:r>
-    </w:p>
-    <w:p>
-      <w:pPr>
-        <w:spacing w:before="280" w:after="120"/>
-      </w:pPr>
-      <w:r>
-        <w:rPr>
-          <w:b/>
-          <w:color w:val="10B981"/>
-          <w:sz w:val="32"/>
-        </w:rPr>
-        <w:t>4. Master Project Development Timeline (8 Months)</w:t>
-      </w:r>
-    </w:p>
-    <w:p>
-      <w:r>
-        <w:t>The total engagement spans 8 calendar months organized into 5 structured project phases:</w:t>
+        <w:t>Below are the monthly running costs in both EGP and USD required to maintain the cloud production environment and third-party APIs:</w:t>
       </w:r>
     </w:p>
     <w:tbl>
@@ -634,7 +1324,7 @@
                 <w:b/>
                 <w:color w:val="FFFFFF"/>
               </w:rPr>
-              <w:t>Project Phase</w:t>
+              <w:t>Operational Component</w:t>
             </w:r>
           </w:p>
         </w:tc>
@@ -649,7 +1339,7 @@
                 <w:b/>
                 <w:color w:val="FFFFFF"/>
               </w:rPr>
-              <w:t>Duration</w:t>
+              <w:t>Provider / Spec</w:t>
             </w:r>
           </w:p>
         </w:tc>
@@ -664,7 +1354,7 @@
                 <w:b/>
                 <w:color w:val="FFFFFF"/>
               </w:rPr>
-              <w:t>Schedule</w:t>
+              <w:t>Est. Monthly Cost (USD)</w:t>
             </w:r>
           </w:p>
         </w:tc>
@@ -679,7 +1369,7 @@
                 <w:b/>
                 <w:color w:val="FFFFFF"/>
               </w:rPr>
-              <w:t>Key Deliverables</w:t>
+              <w:t>Est. Monthly Cost (EGP @ 50 EGP/$)</w:t>
             </w:r>
           </w:p>
         </w:tc>
@@ -688,40 +1378,44 @@
         <w:tc>
           <w:tcPr>
             <w:tcW w:type="dxa" w:w="2484"/>
+            <w:shd w:fill="F8FAFC"/>
           </w:tcPr>
           <w:p>
             <w:r>
-              <w:t>Phase 1: Requirement Gathering &amp; Blueprinting</w:t>
+              <w:t>AWS Infrastructure</w:t>
             </w:r>
           </w:p>
         </w:tc>
         <w:tc>
           <w:tcPr>
             <w:tcW w:type="dxa" w:w="2484"/>
+            <w:shd w:fill="FFFFFF"/>
           </w:tcPr>
           <w:p>
             <w:r>
-              <w:t>1 Month</w:t>
+              <w:t>ALB, EKS (3-10 nodes), Aurora Postgres, Redis, S3, CloudFront</w:t>
             </w:r>
           </w:p>
         </w:tc>
         <w:tc>
           <w:tcPr>
             <w:tcW w:type="dxa" w:w="2484"/>
+            <w:shd w:fill="F8FAFC"/>
           </w:tcPr>
           <w:p>
             <w:r>
-              <w:t>Month 1</w:t>
+              <w:t>~$1,100 / mo</w:t>
             </w:r>
           </w:p>
         </w:tc>
         <w:tc>
           <w:tcPr>
             <w:tcW w:type="dxa" w:w="2484"/>
+            <w:shd w:fill="FFFFFF"/>
           </w:tcPr>
           <w:p>
             <w:r>
-              <w:t>SRS document, Figma UX/UI prototypes, architecture design, API contracts</w:t>
+              <w:t>~55,000 EGP / month</w:t>
             </w:r>
           </w:p>
         </w:tc>
@@ -730,40 +1424,44 @@
         <w:tc>
           <w:tcPr>
             <w:tcW w:type="dxa" w:w="2484"/>
+            <w:shd w:fill="F8FAFC"/>
           </w:tcPr>
           <w:p>
             <w:r>
-              <w:t>Phase 2: Agile Core Development</w:t>
+              <w:t>Firebase FCM Push</w:t>
             </w:r>
           </w:p>
         </w:tc>
         <w:tc>
           <w:tcPr>
             <w:tcW w:type="dxa" w:w="2484"/>
+            <w:shd w:fill="FFFFFF"/>
           </w:tcPr>
           <w:p>
             <w:r>
-              <w:t>3 Months</w:t>
+              <w:t>Android &amp; iOS Push Notifications, Crashlytics, Analytics</w:t>
             </w:r>
           </w:p>
         </w:tc>
         <w:tc>
           <w:tcPr>
             <w:tcW w:type="dxa" w:w="2484"/>
+            <w:shd w:fill="F8FAFC"/>
           </w:tcPr>
           <w:p>
             <w:r>
-              <w:t>Months 2–4</w:t>
+              <w:t>FREE</w:t>
             </w:r>
           </w:p>
         </w:tc>
         <w:tc>
           <w:tcPr>
             <w:tcW w:type="dxa" w:w="2484"/>
+            <w:shd w:fill="FFFFFF"/>
           </w:tcPr>
           <w:p>
             <w:r>
-              <w:t>6 Sprints x 2 weeks: Client portal, AI engine, Admin Notification Center, Distributor app</w:t>
+              <w:t>0 EGP</w:t>
             </w:r>
           </w:p>
         </w:tc>
@@ -772,40 +1470,44 @@
         <w:tc>
           <w:tcPr>
             <w:tcW w:type="dxa" w:w="2484"/>
+            <w:shd w:fill="F8FAFC"/>
           </w:tcPr>
           <w:p>
             <w:r>
-              <w:t>Phase 3: System Integration Testing (SIT)</w:t>
+              <w:t>Transactional Email</w:t>
             </w:r>
           </w:p>
         </w:tc>
         <w:tc>
           <w:tcPr>
             <w:tcW w:type="dxa" w:w="2484"/>
+            <w:shd w:fill="FFFFFF"/>
           </w:tcPr>
           <w:p>
             <w:r>
-              <w:t>1 Month</w:t>
+              <w:t>SendGrid / AWS SES (500,000 emails/mo)</w:t>
             </w:r>
           </w:p>
         </w:tc>
         <w:tc>
           <w:tcPr>
             <w:tcW w:type="dxa" w:w="2484"/>
+            <w:shd w:fill="F8FAFC"/>
           </w:tcPr>
           <w:p>
             <w:r>
-              <w:t>Month 5</w:t>
+              <w:t>~$60 / mo</w:t>
             </w:r>
           </w:p>
         </w:tc>
         <w:tc>
           <w:tcPr>
             <w:tcW w:type="dxa" w:w="2484"/>
+            <w:shd w:fill="FFFFFF"/>
           </w:tcPr>
           <w:p>
             <w:r>
-              <w:t>Full API integration testing, security penetration testing, 2K load testing</w:t>
+              <w:t>~3,000 EGP / month</w:t>
             </w:r>
           </w:p>
         </w:tc>
@@ -814,40 +1516,44 @@
         <w:tc>
           <w:tcPr>
             <w:tcW w:type="dxa" w:w="2484"/>
+            <w:shd w:fill="F8FAFC"/>
           </w:tcPr>
           <w:p>
             <w:r>
-              <w:t>Phase 4: User Acceptance Testing (UAT)</w:t>
+              <w:t>SMS Gateway</w:t>
             </w:r>
           </w:p>
         </w:tc>
         <w:tc>
           <w:tcPr>
             <w:tcW w:type="dxa" w:w="2484"/>
+            <w:shd w:fill="FFFFFF"/>
           </w:tcPr>
           <w:p>
             <w:r>
-              <w:t>2 Months</w:t>
+              <w:t>Twilio / Local Telecom (~20,000 SMS/mo)</w:t>
             </w:r>
           </w:p>
         </w:tc>
         <w:tc>
           <w:tcPr>
             <w:tcW w:type="dxa" w:w="2484"/>
+            <w:shd w:fill="F8FAFC"/>
           </w:tcPr>
           <w:p>
             <w:r>
-              <w:t>Months 6–7</w:t>
+              <w:t>~$300 / mo</w:t>
             </w:r>
           </w:p>
         </w:tc>
         <w:tc>
           <w:tcPr>
             <w:tcW w:type="dxa" w:w="2484"/>
+            <w:shd w:fill="FFFFFF"/>
           </w:tcPr>
           <w:p>
             <w:r>
-              <w:t>Staging environment deployment, client UAT sign-off, feedback iterations</w:t>
+              <w:t>~15,000 EGP / month</w:t>
             </w:r>
           </w:p>
         </w:tc>
@@ -856,75 +1562,94 @@
         <w:tc>
           <w:tcPr>
             <w:tcW w:type="dxa" w:w="2484"/>
+            <w:shd w:fill="F8FAFC"/>
           </w:tcPr>
           <w:p>
             <w:r>
-              <w:t>Phase 5: Go-Live &amp; Hypercare Support</w:t>
+              <w:t>Payment Gateways</w:t>
             </w:r>
           </w:p>
         </w:tc>
         <w:tc>
           <w:tcPr>
             <w:tcW w:type="dxa" w:w="2484"/>
+            <w:shd w:fill="FFFFFF"/>
           </w:tcPr>
           <w:p>
             <w:r>
-              <w:t>1 Month</w:t>
+              <w:t>Stripe / Fawry / PayMob / PayFort</w:t>
             </w:r>
           </w:p>
         </w:tc>
         <w:tc>
           <w:tcPr>
             <w:tcW w:type="dxa" w:w="2484"/>
+            <w:shd w:fill="F8FAFC"/>
           </w:tcPr>
           <w:p>
             <w:r>
-              <w:t>Month 8</w:t>
+              <w:t>2.2% - 2.75% + $0.15/tx</w:t>
             </w:r>
           </w:p>
         </w:tc>
         <w:tc>
           <w:tcPr>
             <w:tcW w:type="dxa" w:w="2484"/>
+            <w:shd w:fill="FFFFFF"/>
           </w:tcPr>
           <w:p>
             <w:r>
-              <w:t>Production deployment, App Store &amp; Google Play launch, 30-day hypercare support</w:t>
+              <w:t>Usage-Based Transactional</w:t>
             </w:r>
           </w:p>
         </w:tc>
       </w:tr>
-    </w:tbl>
-    <w:p>
-      <w:pPr>
-        <w:spacing w:before="280" w:after="120"/>
-      </w:pPr>
-      <w:r>
-        <w:rPr>
-          <w:b/>
-          <w:color w:val="10B981"/>
-          <w:sz w:val="32"/>
-        </w:rPr>
-        <w:t>5. Licenses, Third-Party Integrations &amp; Operational Cost Estimation</w:t>
-      </w:r>
-    </w:p>
-    <w:p>
-      <w:r>
-        <w:t>Below is an itemized breakdown of third-party software licenses, cloud hosting fees, and operational service estimates required to run the platform:</w:t>
-      </w:r>
-    </w:p>
-    <w:tbl>
-      <w:tblPr>
-        <w:tblW w:type="auto" w:w="0"/>
-        <w:jc w:val="center"/>
-        <w:tblLook w:firstColumn="1" w:firstRow="1" w:lastColumn="0" w:lastRow="0" w:noHBand="0" w:noVBand="1" w:val="04A0"/>
-      </w:tblPr>
-      <w:tblGrid>
-        <w:gridCol w:w="2484"/>
-        <w:gridCol w:w="2484"/>
-        <w:gridCol w:w="2484"/>
-        <w:gridCol w:w="2484"/>
-      </w:tblGrid>
+      <w:tr>
+        <w:tc>
+          <w:tcPr>
+            <w:tcW w:type="dxa" w:w="2484"/>
+            <w:shd w:fill="F8FAFC"/>
+          </w:tcPr>
+          <w:p>
+            <w:r>
+              <w:t>Developer Publishers</w:t>
+            </w:r>
+          </w:p>
+        </w:tc>
+        <w:tc>
+          <w:tcPr>
+            <w:tcW w:type="dxa" w:w="2484"/>
+            <w:shd w:fill="FFFFFF"/>
+          </w:tcPr>
+          <w:p>
+            <w:r>
+              <w:t>Apple Developer ($99/yr) + Google Play ($25 one-time)</w:t>
+            </w:r>
+          </w:p>
+        </w:tc>
+        <w:tc>
+          <w:tcPr>
+            <w:tcW w:type="dxa" w:w="2484"/>
+            <w:shd w:fill="F8FAFC"/>
+          </w:tcPr>
+          <w:p>
+            <w:r>
+              <w:t>~$10 / mo avg</w:t>
+            </w:r>
+          </w:p>
+        </w:tc>
+        <w:tc>
+          <w:tcPr>
+            <w:tcW w:type="dxa" w:w="2484"/>
+            <w:shd w:fill="FFFFFF"/>
+          </w:tcPr>
+          <w:p>
+            <w:r>
+              <w:t>~500 EGP / month</w:t>
+            </w:r>
+          </w:p>
+        </w:tc>
+      </w:tr>
       <w:tr>
         <w:tc>
           <w:tcPr>
@@ -937,7 +1662,7 @@
                 <w:b/>
                 <w:color w:val="FFFFFF"/>
               </w:rPr>
-              <w:t>Service / Integration</w:t>
+              <w:t>TOTAL OPERATIONAL RUNNING COST</w:t>
             </w:r>
           </w:p>
         </w:tc>
@@ -952,7 +1677,7 @@
                 <w:b/>
                 <w:color w:val="FFFFFF"/>
               </w:rPr>
-              <w:t>Scope &amp; Tooling</w:t>
+              <w:t>Cloud + Third-Party Services</w:t>
             </w:r>
           </w:p>
         </w:tc>
@@ -967,7 +1692,7 @@
                 <w:b/>
                 <w:color w:val="FFFFFF"/>
               </w:rPr>
-              <w:t>Estimated Cost Structure</w:t>
+              <w:t>~$1,470 / month</w:t>
             </w:r>
           </w:p>
         </w:tc>
@@ -982,694 +1707,7 @@
                 <w:b/>
                 <w:color w:val="FFFFFF"/>
               </w:rPr>
-              <w:t>Operational Notes</w:t>
-            </w:r>
-          </w:p>
-        </w:tc>
-      </w:tr>
-      <w:tr>
-        <w:tc>
-          <w:tcPr>
-            <w:tcW w:type="dxa" w:w="2484"/>
-          </w:tcPr>
-          <w:p>
-            <w:r>
-              <w:t>Cloud Infrastructure (AWS / GCP)</w:t>
-            </w:r>
-          </w:p>
-        </w:tc>
-        <w:tc>
-          <w:tcPr>
-            <w:tcW w:type="dxa" w:w="2484"/>
-          </w:tcPr>
-          <w:p>
-            <w:r>
-              <w:t>AWS ALB, EKS, Aurora Postgres, ElastiCache, S3, CloudFront</w:t>
-            </w:r>
-          </w:p>
-        </w:tc>
-        <w:tc>
-          <w:tcPr>
-            <w:tcW w:type="dxa" w:w="2484"/>
-          </w:tcPr>
-          <w:p>
-            <w:r>
-              <w:t>~$850 - $1,400 / month</w:t>
-            </w:r>
-          </w:p>
-        </w:tc>
-        <w:tc>
-          <w:tcPr>
-            <w:tcW w:type="dxa" w:w="2484"/>
-          </w:tcPr>
-          <w:p>
-            <w:r>
-              <w:t>Based on 2M registered users &amp; 2,000 peak concurrent active load</w:t>
-            </w:r>
-          </w:p>
-        </w:tc>
-      </w:tr>
-      <w:tr>
-        <w:tc>
-          <w:tcPr>
-            <w:tcW w:type="dxa" w:w="2484"/>
-          </w:tcPr>
-          <w:p>
-            <w:r>
-              <w:t>Firebase Cloud Messaging (FCM)</w:t>
-            </w:r>
-          </w:p>
-        </w:tc>
-        <w:tc>
-          <w:tcPr>
-            <w:tcW w:type="dxa" w:w="2484"/>
-          </w:tcPr>
-          <w:p>
-            <w:r>
-              <w:t>Android &amp; iOS Push Notifications, Crashlytics, Analytics</w:t>
-            </w:r>
-          </w:p>
-        </w:tc>
-        <w:tc>
-          <w:tcPr>
-            <w:tcW w:type="dxa" w:w="2484"/>
-          </w:tcPr>
-          <w:p>
-            <w:r>
-              <w:t>FREE (Unlimited)</w:t>
-            </w:r>
-          </w:p>
-        </w:tc>
-        <w:tc>
-          <w:tcPr>
-            <w:tcW w:type="dxa" w:w="2484"/>
-          </w:tcPr>
-          <w:p>
-            <w:r>
-              <w:t>Google Firebase standard tier for mobile push alerts</w:t>
-            </w:r>
-          </w:p>
-        </w:tc>
-      </w:tr>
-      <w:tr>
-        <w:tc>
-          <w:tcPr>
-            <w:tcW w:type="dxa" w:w="2484"/>
-          </w:tcPr>
-          <w:p>
-            <w:r>
-              <w:t>Payment Gateways</w:t>
-            </w:r>
-          </w:p>
-        </w:tc>
-        <w:tc>
-          <w:tcPr>
-            <w:tcW w:type="dxa" w:w="2484"/>
-          </w:tcPr>
-          <w:p>
-            <w:r>
-              <w:t>Stripe / Fawry / PayMob / PayFort integrations</w:t>
-            </w:r>
-          </w:p>
-        </w:tc>
-        <w:tc>
-          <w:tcPr>
-            <w:tcW w:type="dxa" w:w="2484"/>
-          </w:tcPr>
-          <w:p>
-            <w:r>
-              <w:t>2.2% - 2.75% + $0.15 per transaction</w:t>
-            </w:r>
-          </w:p>
-        </w:tc>
-        <w:tc>
-          <w:tcPr>
-            <w:tcW w:type="dxa" w:w="2484"/>
-          </w:tcPr>
-          <w:p>
-            <w:r>
-              <w:t>Pay-as-you-go transaction fee structure</w:t>
-            </w:r>
-          </w:p>
-        </w:tc>
-      </w:tr>
-      <w:tr>
-        <w:tc>
-          <w:tcPr>
-            <w:tcW w:type="dxa" w:w="2484"/>
-          </w:tcPr>
-          <w:p>
-            <w:r>
-              <w:t>Transactional Email Service</w:t>
-            </w:r>
-          </w:p>
-        </w:tc>
-        <w:tc>
-          <w:tcPr>
-            <w:tcW w:type="dxa" w:w="2484"/>
-          </w:tcPr>
-          <w:p>
-            <w:r>
-              <w:t>SendGrid / AWS SES (500,000 emails/month)</w:t>
-            </w:r>
-          </w:p>
-        </w:tc>
-        <w:tc>
-          <w:tcPr>
-            <w:tcW w:type="dxa" w:w="2484"/>
-          </w:tcPr>
-          <w:p>
-            <w:r>
-              <w:t>~$40 - $80 / month</w:t>
-            </w:r>
-          </w:p>
-        </w:tc>
-        <w:tc>
-          <w:tcPr>
-            <w:tcW w:type="dxa" w:w="2484"/>
-          </w:tcPr>
-          <w:p>
-            <w:r>
-              <w:t>Order receipts, password reset, automated health campaigns</w:t>
-            </w:r>
-          </w:p>
-        </w:tc>
-      </w:tr>
-      <w:tr>
-        <w:tc>
-          <w:tcPr>
-            <w:tcW w:type="dxa" w:w="2484"/>
-          </w:tcPr>
-          <w:p>
-            <w:r>
-              <w:t>SMS Notification Gateway</w:t>
-            </w:r>
-          </w:p>
-        </w:tc>
-        <w:tc>
-          <w:tcPr>
-            <w:tcW w:type="dxa" w:w="2484"/>
-          </w:tcPr>
-          <w:p>
-            <w:r>
-              <w:t>Twilio / Local Telecom Aggregator (~20,000 SMS/mo)</w:t>
-            </w:r>
-          </w:p>
-        </w:tc>
-        <w:tc>
-          <w:tcPr>
-            <w:tcW w:type="dxa" w:w="2484"/>
-          </w:tcPr>
-          <w:p>
-            <w:r>
-              <w:t>~$200 - $400 / month</w:t>
-            </w:r>
-          </w:p>
-        </w:tc>
-        <w:tc>
-          <w:tcPr>
-            <w:tcW w:type="dxa" w:w="2484"/>
-          </w:tcPr>
-          <w:p>
-            <w:r>
-              <w:t>OTP verification, abandoned cart SMS alerts</w:t>
-            </w:r>
-          </w:p>
-        </w:tc>
-      </w:tr>
-      <w:tr>
-        <w:tc>
-          <w:tcPr>
-            <w:tcW w:type="dxa" w:w="2484"/>
-          </w:tcPr>
-          <w:p>
-            <w:r>
-              <w:t>Developer Licenses</w:t>
-            </w:r>
-          </w:p>
-        </w:tc>
-        <w:tc>
-          <w:tcPr>
-            <w:tcW w:type="dxa" w:w="2484"/>
-          </w:tcPr>
-          <w:p>
-            <w:r>
-              <w:t>Apple Developer Enterprise ($99/yr) + Google Play ($25 one-time)</w:t>
-            </w:r>
-          </w:p>
-        </w:tc>
-        <w:tc>
-          <w:tcPr>
-            <w:tcW w:type="dxa" w:w="2484"/>
-          </w:tcPr>
-          <w:p>
-            <w:r>
-              <w:t>~$124 total (Annual)</w:t>
-            </w:r>
-          </w:p>
-        </w:tc>
-        <w:tc>
-          <w:tcPr>
-            <w:tcW w:type="dxa" w:w="2484"/>
-          </w:tcPr>
-          <w:p>
-            <w:r>
-              <w:t>Official App Store and Google Play distribution accounts</w:t>
-            </w:r>
-          </w:p>
-        </w:tc>
-      </w:tr>
-    </w:tbl>
-    <w:p>
-      <w:pPr>
-        <w:spacing w:before="280" w:after="120"/>
-      </w:pPr>
-      <w:r>
-        <w:rPr>
-          <w:b/>
-          <w:color w:val="10B981"/>
-          <w:sz w:val="32"/>
-        </w:rPr>
-        <w:t>6. Application Features &amp; Business Architecture</w:t>
-      </w:r>
-    </w:p>
-    <w:p>
-      <w:r>
-        <w:t>The solution is built on a modular role-based architecture serving four primary user archetypes:</w:t>
-      </w:r>
-    </w:p>
-    <w:p>
-      <w:pPr>
-        <w:spacing w:before="280" w:after="120"/>
-      </w:pPr>
-      <w:r>
-        <w:rPr>
-          <w:b/>
-          <w:color w:val="0F172A"/>
-          <w:sz w:val="26"/>
-        </w:rPr>
-        <w:t>1. Mobile &amp; Web Client Portal</w:t>
-      </w:r>
-    </w:p>
-    <w:p>
-      <w:r>
-        <w:t>Personalized AI supplement recommender based on age/gender/goals, chronic disease safety contraindication checker (Hypertension, Kidney Disease, Allergies), daily hydration calculator, shopping cart, promo code redemption, credit card/COD checkout, and real-time order tracking stepper.</w:t>
-      </w:r>
-    </w:p>
-    <w:p>
-      <w:pPr>
-        <w:spacing w:before="280" w:after="120"/>
-      </w:pPr>
-      <w:r>
-        <w:rPr>
-          <w:b/>
-          <w:color w:val="0F172A"/>
-          <w:sz w:val="26"/>
-        </w:rPr>
-        <w:t>2. Admin Notification Center &amp; Portal</w:t>
-      </w:r>
-    </w:p>
-    <w:p>
-      <w:r>
-        <w:t>Multi-channel notification engine (Android Push, iOS Push, Email, SMS), target segment rules (chronic patients, low stock alerts, abandoned cart), automated AI recommendation broadcasts, promo discount manager, product catalog CRUD, and revenue/sales analytics dashboard.</w:t>
-      </w:r>
-    </w:p>
-    <w:p>
-      <w:pPr>
-        <w:spacing w:before="280" w:after="120"/>
-      </w:pPr>
-      <w:r>
-        <w:rPr>
-          <w:b/>
-          <w:color w:val="0F172A"/>
-          <w:sz w:val="26"/>
-        </w:rPr>
-        <w:t>3. Distributor Logistics Portal</w:t>
-      </w:r>
-    </w:p>
-    <w:p>
-      <w:r>
-        <w:t>Delivery driver queue management, status progression stepper (Pending -&gt; Picked Up -&gt; Out for Delivery -&gt; Delivered), warehouse stock capacity gauges, and low stock reorder triggers.</w:t>
-      </w:r>
-    </w:p>
-    <w:p>
-      <w:pPr>
-        <w:spacing w:before="280" w:after="120"/>
-      </w:pPr>
-      <w:r>
-        <w:rPr>
-          <w:b/>
-          <w:color w:val="0F172A"/>
-          <w:sz w:val="26"/>
-        </w:rPr>
-        <w:t>4. Visitor / Public Storefront</w:t>
-      </w:r>
-    </w:p>
-    <w:p>
-      <w:r>
-        <w:t>Seamless browsing of official Limitless Naturals catalog, health category filters (Daily Wellness, Immune Defense, Hydration), ingredient breakdown, and quick login/registration prompt.</w:t>
-      </w:r>
-    </w:p>
-    <w:p>
-      <w:pPr>
-        <w:spacing w:before="280" w:after="120"/>
-      </w:pPr>
-      <w:r>
-        <w:rPr>
-          <w:b/>
-          <w:color w:val="10B981"/>
-          <w:sz w:val="32"/>
-        </w:rPr>
-        <w:t>7. Milestone-Based Payment Schedule</w:t>
-      </w:r>
-    </w:p>
-    <w:p>
-      <w:r>
-        <w:t>Payments are structured across project milestones linked directly to verified deliverables and sign-offs:</w:t>
-      </w:r>
-    </w:p>
-    <w:tbl>
-      <w:tblPr>
-        <w:tblW w:type="auto" w:w="0"/>
-        <w:jc w:val="center"/>
-        <w:tblLook w:firstColumn="1" w:firstRow="1" w:lastColumn="0" w:lastRow="0" w:noHBand="0" w:noVBand="1" w:val="04A0"/>
-      </w:tblPr>
-      <w:tblGrid>
-        <w:gridCol w:w="2484"/>
-        <w:gridCol w:w="2484"/>
-        <w:gridCol w:w="2484"/>
-        <w:gridCol w:w="2484"/>
-      </w:tblGrid>
-      <w:tr>
-        <w:tc>
-          <w:tcPr>
-            <w:tcW w:type="dxa" w:w="2484"/>
-            <w:shd w:fill="0F172A"/>
-          </w:tcPr>
-          <w:p>
-            <w:r>
-              <w:rPr>
-                <w:b/>
-                <w:color w:val="FFFFFF"/>
-              </w:rPr>
-              <w:t>Milestone</w:t>
-            </w:r>
-          </w:p>
-        </w:tc>
-        <w:tc>
-          <w:tcPr>
-            <w:tcW w:type="dxa" w:w="2484"/>
-            <w:shd w:fill="0F172A"/>
-          </w:tcPr>
-          <w:p>
-            <w:r>
-              <w:rPr>
-                <w:b/>
-                <w:color w:val="FFFFFF"/>
-              </w:rPr>
-              <w:t>Target Timeline</w:t>
-            </w:r>
-          </w:p>
-        </w:tc>
-        <w:tc>
-          <w:tcPr>
-            <w:tcW w:type="dxa" w:w="2484"/>
-            <w:shd w:fill="0F172A"/>
-          </w:tcPr>
-          <w:p>
-            <w:r>
-              <w:rPr>
-                <w:b/>
-                <w:color w:val="FFFFFF"/>
-              </w:rPr>
-              <w:t>Payment %</w:t>
-            </w:r>
-          </w:p>
-        </w:tc>
-        <w:tc>
-          <w:tcPr>
-            <w:tcW w:type="dxa" w:w="2484"/>
-            <w:shd w:fill="0F172A"/>
-          </w:tcPr>
-          <w:p>
-            <w:r>
-              <w:rPr>
-                <w:b/>
-                <w:color w:val="FFFFFF"/>
-              </w:rPr>
-              <w:t>Trigger Condition / Deliverable</w:t>
-            </w:r>
-          </w:p>
-        </w:tc>
-      </w:tr>
-      <w:tr>
-        <w:tc>
-          <w:tcPr>
-            <w:tcW w:type="dxa" w:w="2484"/>
-          </w:tcPr>
-          <w:p>
-            <w:r>
-              <w:t>Milestone 1: Project Kickoff &amp; SRS Approval</w:t>
-            </w:r>
-          </w:p>
-        </w:tc>
-        <w:tc>
-          <w:tcPr>
-            <w:tcW w:type="dxa" w:w="2484"/>
-          </w:tcPr>
-          <w:p>
-            <w:r>
-              <w:t>Phase 1 (Month 1)</w:t>
-            </w:r>
-          </w:p>
-        </w:tc>
-        <w:tc>
-          <w:tcPr>
-            <w:tcW w:type="dxa" w:w="2484"/>
-          </w:tcPr>
-          <w:p>
-            <w:r>
-              <w:t>15%</w:t>
-            </w:r>
-          </w:p>
-        </w:tc>
-        <w:tc>
-          <w:tcPr>
-            <w:tcW w:type="dxa" w:w="2484"/>
-          </w:tcPr>
-          <w:p>
-            <w:r>
-              <w:t>Approval of SRS document, Figma designs, and setup of cloud staging environments</w:t>
-            </w:r>
-          </w:p>
-        </w:tc>
-      </w:tr>
-      <w:tr>
-        <w:tc>
-          <w:tcPr>
-            <w:tcW w:type="dxa" w:w="2484"/>
-          </w:tcPr>
-          <w:p>
-            <w:r>
-              <w:t>Milestone 2: Core Development Sprint Phase A</w:t>
-            </w:r>
-          </w:p>
-        </w:tc>
-        <w:tc>
-          <w:tcPr>
-            <w:tcW w:type="dxa" w:w="2484"/>
-          </w:tcPr>
-          <w:p>
-            <w:r>
-              <w:t>Phase 2 (Months 2–3)</w:t>
-            </w:r>
-          </w:p>
-        </w:tc>
-        <w:tc>
-          <w:tcPr>
-            <w:tcW w:type="dxa" w:w="2484"/>
-          </w:tcPr>
-          <w:p>
-            <w:r>
-              <w:t>25%</w:t>
-            </w:r>
-          </w:p>
-        </w:tc>
-        <w:tc>
-          <w:tcPr>
-            <w:tcW w:type="dxa" w:w="2484"/>
-          </w:tcPr>
-          <w:p>
-            <w:r>
-              <w:t>Completion of Sprints 1–3: Client App, Authentication, AI Engine &amp; Product Catalog</w:t>
-            </w:r>
-          </w:p>
-        </w:tc>
-      </w:tr>
-      <w:tr>
-        <w:tc>
-          <w:tcPr>
-            <w:tcW w:type="dxa" w:w="2484"/>
-          </w:tcPr>
-          <w:p>
-            <w:r>
-              <w:t>Milestone 3: Core Development Sprint Phase B</w:t>
-            </w:r>
-          </w:p>
-        </w:tc>
-        <w:tc>
-          <w:tcPr>
-            <w:tcW w:type="dxa" w:w="2484"/>
-          </w:tcPr>
-          <w:p>
-            <w:r>
-              <w:t>Phase 2 (Month 4)</w:t>
-            </w:r>
-          </w:p>
-        </w:tc>
-        <w:tc>
-          <w:tcPr>
-            <w:tcW w:type="dxa" w:w="2484"/>
-          </w:tcPr>
-          <w:p>
-            <w:r>
-              <w:t>25%</w:t>
-            </w:r>
-          </w:p>
-        </w:tc>
-        <w:tc>
-          <w:tcPr>
-            <w:tcW w:type="dxa" w:w="2484"/>
-          </w:tcPr>
-          <w:p>
-            <w:r>
-              <w:t>Completion of Sprints 4–6: Admin Notification Center, Checkout, Distributor App</w:t>
-            </w:r>
-          </w:p>
-        </w:tc>
-      </w:tr>
-      <w:tr>
-        <w:tc>
-          <w:tcPr>
-            <w:tcW w:type="dxa" w:w="2484"/>
-          </w:tcPr>
-          <w:p>
-            <w:r>
-              <w:t>Milestone 4: System Integration Testing (SIT)</w:t>
-            </w:r>
-          </w:p>
-        </w:tc>
-        <w:tc>
-          <w:tcPr>
-            <w:tcW w:type="dxa" w:w="2484"/>
-          </w:tcPr>
-          <w:p>
-            <w:r>
-              <w:t>Phase 3 (Month 5)</w:t>
-            </w:r>
-          </w:p>
-        </w:tc>
-        <w:tc>
-          <w:tcPr>
-            <w:tcW w:type="dxa" w:w="2484"/>
-          </w:tcPr>
-          <w:p>
-            <w:r>
-              <w:t>15%</w:t>
-            </w:r>
-          </w:p>
-        </w:tc>
-        <w:tc>
-          <w:tcPr>
-            <w:tcW w:type="dxa" w:w="2484"/>
-          </w:tcPr>
-          <w:p>
-            <w:r>
-              <w:t>Successful completion of SIT, security audit, and 2,000 concurrent load test</w:t>
-            </w:r>
-          </w:p>
-        </w:tc>
-      </w:tr>
-      <w:tr>
-        <w:tc>
-          <w:tcPr>
-            <w:tcW w:type="dxa" w:w="2484"/>
-          </w:tcPr>
-          <w:p>
-            <w:r>
-              <w:t>Milestone 5: User Acceptance Testing (UAT)</w:t>
-            </w:r>
-          </w:p>
-        </w:tc>
-        <w:tc>
-          <w:tcPr>
-            <w:tcW w:type="dxa" w:w="2484"/>
-          </w:tcPr>
-          <w:p>
-            <w:r>
-              <w:t>Phase 4 (Months 6–7)</w:t>
-            </w:r>
-          </w:p>
-        </w:tc>
-        <w:tc>
-          <w:tcPr>
-            <w:tcW w:type="dxa" w:w="2484"/>
-          </w:tcPr>
-          <w:p>
-            <w:r>
-              <w:t>10%</w:t>
-            </w:r>
-          </w:p>
-        </w:tc>
-        <w:tc>
-          <w:tcPr>
-            <w:tcW w:type="dxa" w:w="2484"/>
-          </w:tcPr>
-          <w:p>
-            <w:r>
-              <w:t>Client UAT sign-off and completion of all user feedback adjustments</w:t>
-            </w:r>
-          </w:p>
-        </w:tc>
-      </w:tr>
-      <w:tr>
-        <w:tc>
-          <w:tcPr>
-            <w:tcW w:type="dxa" w:w="2484"/>
-          </w:tcPr>
-          <w:p>
-            <w:r>
-              <w:t>Milestone 6: Go-Live &amp; Handover</w:t>
-            </w:r>
-          </w:p>
-        </w:tc>
-        <w:tc>
-          <w:tcPr>
-            <w:tcW w:type="dxa" w:w="2484"/>
-          </w:tcPr>
-          <w:p>
-            <w:r>
-              <w:t>Phase 5 (Month 8)</w:t>
-            </w:r>
-          </w:p>
-        </w:tc>
-        <w:tc>
-          <w:tcPr>
-            <w:tcW w:type="dxa" w:w="2484"/>
-          </w:tcPr>
-          <w:p>
-            <w:r>
-              <w:t>10%</w:t>
-            </w:r>
-          </w:p>
-        </w:tc>
-        <w:tc>
-          <w:tcPr>
-            <w:tcW w:type="dxa" w:w="2484"/>
-          </w:tcPr>
-          <w:p>
-            <w:r>
-              <w:t>Successful deployment to App Store, Google Play, Web hosting, and hypercare handover</w:t>
+              <w:t>~73,500 EGP / month</w:t>
             </w:r>
           </w:p>
         </w:tc>

</xml_diff>